<commit_message>
audit théologique recits_coran.docx : 5 corrections
R9 Loth: fitra remplace formulation sensible
R4 Khidr: note statut prophétique débattu
R16 Dawud: cinq pierres = tradition antérieure
R18 Fossé: référence Muslim 3005 précisée
R19 Issa/Table: reformulation doctrinale

Co-Authored-By: Claude Opus 4.6 (1M context) <noreply@anthropic.com>
</commit_message>
<xml_diff>
--- a/ECRITS_NIYYAH/recits_coran.docx
+++ b/ECRITS_NIYYAH/recits_coran.docx
@@ -1005,7 +1005,7 @@
           <w:sz w:val="20"/>
           <w:szCs w:val="20"/>
         </w:rPr>
-        <w:t xml:space="preserve">Sourate Al-Kahf (18:60-82) — identification d'Al-Khidr par les hadiths (Bukhari, Muslim)</w:t>
+        <w:t xml:space="preserve">Sourate Al-Kahf (18:60-82) — identification d'Al-Khidr par les hadiths (Bukhari, Muslim) · Note : statut prophétique débattu — position majoritaire chez les sunnites : prophète</w:t>
       </w:r>
     </w:p>
     <w:p>
@@ -2643,7 +2643,7 @@
           <w:sz w:val="22"/>
           <w:szCs w:val="22"/>
         </w:rPr>
-        <w:t xml:space="preserve">Les gens de cette terre avaient inventé quelque chose. Quelque chose qu'aucun peuple avant eux n'avait fait. Ils délaissaient leurs épouses pour aller vers les hommes — non par amour, mais par envie de transgresser. Ils brigandaient leurs visiteurs. Ils insultaient leurs hôtes. Ils faisaient le mal dans leurs assemblées, devant tout le monde, en riant.</w:t>
+        <w:t xml:space="preserve">Les gens de cette terre avaient inventé quelque chose. Quelque chose qu'aucun peuple avant eux n'avait fait. Ils approchaient leurs semblables contrairement à la fitra qu'Allâh a créée. Ils brigandaient leurs visiteurs. Ils insultaient leurs hôtes. Ils faisaient le mal dans leurs assemblées, devant tout le monde, en riant.</w:t>
       </w:r>
     </w:p>
     <w:p>
@@ -5204,7 +5204,7 @@
           <w:sz w:val="22"/>
           <w:szCs w:val="22"/>
         </w:rPr>
-        <w:t xml:space="preserve">Sans armure. Sans épée. Avec une fronde et cinq pierres ramassées dans le lit du fleuve.</w:t>
+        <w:t xml:space="preserve">Sans armure. Sans épée. Avec une fronde et — selon la tradition antérieure à l'Islam — cinq pierres ramassées dans le lit du fleuve.</w:t>
       </w:r>
     </w:p>
     <w:p>
@@ -5854,7 +5854,7 @@
           <w:sz w:val="22"/>
           <w:szCs w:val="22"/>
         </w:rPr>
-        <w:t xml:space="preserve">L'enfant, dans ses bras, dit clairement — et c'est rapporté dans les hadiths :</w:t>
+        <w:t xml:space="preserve">L'enfant, dans ses bras, dit clairement — et c'est rapporté par Muslim n°3005 (hadith de Suhayb) :</w:t>
       </w:r>
     </w:p>
     <w:p>
@@ -6205,7 +6205,7 @@
           <w:sz w:val="22"/>
           <w:szCs w:val="22"/>
         </w:rPr>
-        <w:t xml:space="preserve">Le Coran ne dit pas ce qui se passa ensuite. Il laisse la table planer là — entre ciel et terre — comme une question.</w:t>
+        <w:t xml:space="preserve">Le Coran ne décrit pas le festin lui-même. Mais il a déjà dit l'essentiel : un signe reçu est un poids porté.</w:t>
       </w:r>
     </w:p>
     <w:p>

</xml_diff>

<commit_message>
audit recits_coran.docx phase 2 : 4 corrections Gemini
R4 Moussa/Khidr: nuance orgueil→omission de rapporter la science à Allah
R9 Loth: citation coranique directe (7:81) + fitra
R11 Hud/Ad: retrait délégation La Mecque (Tabari, pas Coran)
R17 Éléphant: note Abraha = Sîra, pas Coran

Co-Authored-By: Claude Opus 4.6 (1M context) <noreply@anthropic.com>
</commit_message>
<xml_diff>
--- a/ECRITS_NIYYAH/recits_coran.docx
+++ b/ECRITS_NIYYAH/recits_coran.docx
@@ -1018,7 +1018,7 @@
           <w:sz w:val="22"/>
           <w:szCs w:val="22"/>
         </w:rPr>
-        <w:t xml:space="preserve">Moussa avait été choisi. Allâh lui parlait — directement, sans voile. Il avait fendu la mer. Il avait reçu la Loi. Il était, parmi les prophètes, celui qui pouvait dire : je sais.</w:t>
+        <w:t xml:space="preserve">Moussa avait été choisi. Allâh lui parlait — directement, sans voile. Il avait fendu la mer. Il avait reçu la Loi. Il était, parmi les prophètes de son temps, le plus savant — et il le savait.</w:t>
       </w:r>
     </w:p>
     <w:p>
@@ -1070,7 +1070,7 @@
           <w:sz w:val="22"/>
           <w:szCs w:val="22"/>
         </w:rPr>
-        <w:t xml:space="preserve">Allâh n'aima pas cette réponse. Il révéla à Moussa qu'au confluent des deux mers, vivait un serviteur — un homme à qui Allâh avait donné une science que Moussa n'avait pas.</w:t>
+        <w:t xml:space="preserve">Ce n'était pas de l'orgueil. C'était un constat. Mais Moussa avait oublié de rapporter la science à sa Source — il n'avait pas dit Allâhu a'lam, Allâh sait mieux. Et Allâh, qui veille sur Ses prophètes, voulut l'instruire. Il révéla à Moussa qu'au confluent des deux mers, vivait un serviteur — un homme à qui Allâh avait donné une science que Moussa n'avait pas.</w:t>
       </w:r>
     </w:p>
     <w:p>
@@ -2643,7 +2643,7 @@
           <w:sz w:val="22"/>
           <w:szCs w:val="22"/>
         </w:rPr>
-        <w:t xml:space="preserve">Les gens de cette terre avaient inventé quelque chose. Quelque chose qu'aucun peuple avant eux n'avait fait. Ils approchaient leurs semblables contrairement à la fitra qu'Allâh a créée. Ils brigandaient leurs visiteurs. Ils insultaient leurs hôtes. Ils faisaient le mal dans leurs assemblées, devant tout le monde, en riant.</w:t>
+        <w:t xml:space="preserve">Les gens de cette terre avaient inventé quelque chose. Quelque chose qu'aucun peuple avant eux n'avait fait. Ils s'approchaient des hommes par convoitise, au lieu des femmes — comme le Coran lui-même le rapporte. Une transgression de la fitra qu'Allâh avait inscrite dans la création. Ils brigandaient leurs visiteurs. Ils insultaient leurs hôtes. Ils faisaient le mal dans leurs assemblées, devant tout le monde, en riant.</w:t>
       </w:r>
     </w:p>
     <w:p>
@@ -3384,33 +3384,20 @@
           <w:sz w:val="22"/>
           <w:szCs w:val="22"/>
         </w:rPr>
-        <w:t xml:space="preserve">Trois ans sans pluie. Les sources s'asséchèrent. Le bétail mourut. La terre se fissura. Les Ad envoyèrent une délégation aux Maisons sacrées — à La Mecque, déjà, où on disait que les prières étaient exaucées.</w:t>
-      </w:r>
-    </w:p>
-    <w:p>
-      <w:pPr>
-        <w:spacing w:after="60"/>
-      </w:pPr>
-      <w:r>
-        <w:rPr>
-          <w:rFonts w:ascii="Cormorant Garamond" w:cs="Cormorant Garamond" w:eastAsia="Cormorant Garamond" w:hAnsi="Cormorant Garamond"/>
-          <w:sz w:val="22"/>
-          <w:szCs w:val="22"/>
-        </w:rPr>
-        <w:t xml:space="preserve">Là-bas, ils prièrent pour la pluie.</w:t>
-      </w:r>
-    </w:p>
-    <w:p>
-      <w:pPr>
-        <w:spacing w:after="60"/>
-      </w:pPr>
-      <w:r>
-        <w:rPr>
-          <w:rFonts w:ascii="Cormorant Garamond" w:cs="Cormorant Garamond" w:eastAsia="Cormorant Garamond" w:hAnsi="Cormorant Garamond"/>
-          <w:sz w:val="22"/>
-          <w:szCs w:val="22"/>
-        </w:rPr>
-        <w:t xml:space="preserve">Et Allâh leur envoya un nuage.</w:t>
+        <w:t xml:space="preserve">Trois ans sans pluie. Les sources s'asséchèrent. Le bétail mourut. La terre se fissura. Les Ad attendirent — comme tous les peuples attendent — un signe du ciel.</w:t>
+      </w:r>
+    </w:p>
+    <w:p>
+      <w:pPr>
+        <w:spacing w:after="60"/>
+      </w:pPr>
+      <w:r>
+        <w:rPr>
+          <w:rFonts w:ascii="Cormorant Garamond" w:cs="Cormorant Garamond" w:eastAsia="Cormorant Garamond" w:hAnsi="Cormorant Garamond"/>
+          <w:sz w:val="22"/>
+          <w:szCs w:val="22"/>
+        </w:rPr>
+        <w:t xml:space="preserve">Un jour, à l'horizon de leur vallée, apparut un nuage.</w:t>
       </w:r>
     </w:p>
     <w:p>
@@ -5308,7 +5295,7 @@
           <w:sz w:val="20"/>
           <w:szCs w:val="20"/>
         </w:rPr>
-        <w:t xml:space="preserve">Sourate Al-Fil (105:1-5)</w:t>
+        <w:t xml:space="preserve">Sourate Al-Fil (105:1-5) — Note : le Coran parle des « Compagnons de l'Éléphant ». Le nom d'Abraha et les détails de l'expédition proviennent de la Sîra et des chroniques historiques.</w:t>
       </w:r>
     </w:p>
     <w:p>

</xml_diff>

<commit_message>
audit recits Coran v2 — démarcation Israeliyyât (8 corrections + intro module)
- Introduction module : disclaimer Israeliyyât / exégèse vs Coran
- Récit 1 (Nimrod) : identification + mouche = Israeliyyât marquées
- Récit 4 (Khidr) : statut prophétique nuancé (Ibn Kathîr vs Ibn Hazm)
- Récit 4 (Khidr) : manteau vert = tradition, pas texte sacré
- Récit 8 (Habil/Qabil) : noms non coraniques signalés + offrande nuancée
- Récit 10 (Saleh) : chamelle de la roche = Israeliyyât, couleurs visage idem
- Récit 11 (Ad) : géants nuancé (bastatan fî-l-khalq), 3 ans non coranique
- Récit 12 (Ayoub) : durée non coranique, cheveux exégétique, ajout serment 38:44
- Récit 14 (Saba) : nom Bilqis = tradition, pas Coran
- Récit 16 (Talut) : fronde/pierres = tradition biblique signalée
- Structure JSON : tableau → objet {module, introduction, items}
- Docx régénéré (20 récits, 33 Ko, clean)

Co-Authored-By: Claude Opus 4.6 (1M context) <noreply@anthropic.com>
</commit_message>
<xml_diff>
--- a/ECRITS_NIYYAH/recits_coran.docx
+++ b/ECRITS_NIYYAH/recits_coran.docx
@@ -5,7 +5,7 @@
     <w:p>
       <w:pPr>
         <w:pStyle w:val="Title"/>
-        <w:spacing w:after="300"/>
+        <w:spacing w:after="200"/>
       </w:pPr>
       <w:r>
         <w:rPr>
@@ -16,6 +16,22 @@
           <w:szCs w:val="36"/>
         </w:rPr>
         <w:t xml:space="preserve">Récits du Coran — 20 récits</w:t>
+      </w:r>
+    </w:p>
+    <w:p>
+      <w:pPr>
+        <w:spacing w:after="300"/>
+      </w:pPr>
+      <w:r>
+        <w:rPr>
+          <w:rFonts w:ascii="Cormorant Garamond" w:cs="Cormorant Garamond" w:eastAsia="Cormorant Garamond" w:hAnsi="Cormorant Garamond"/>
+          <w:i/>
+          <w:iCs/>
+          <w:color w:val="888888"/>
+          <w:sz w:val="20"/>
+          <w:szCs w:val="20"/>
+        </w:rPr>
+        <w:t xml:space="preserve">Ces récits sont basés sur le Coran. Certains détails proviennent de la tradition exégétique classique (Ibn Kathîr, Tabarî) ou des Israeliyyât (récits transmis par des convertis juifs et chrétiens des débuts de l’Islam). Ces ajouts traditionnels sont signalés dans le texte ou les sources. Le Coran lui-même reste la référence — quand un détail manque dans le Coran, c’est qu’Allâh n’a pas voulu nous le dire.</w:t>
       </w:r>
     </w:p>
     <w:p>
@@ -306,7 +322,7 @@
           <w:sz w:val="22"/>
           <w:szCs w:val="22"/>
         </w:rPr>
-        <w:t xml:space="preserve">Le Coran s'arrête là. Il ne le nomme pas — il le laisse dans l'anonymat des hommes vaincus. Mais Ibn Kathîr et les anciens racontent qu'à la fin de cette vie d'orgueil, Nimrod mourut. Et il ne mourut pas d'une lame. Ni d'un poison. Ni d'une révolte.</w:t>
+        <w:t xml:space="preserve">Le Coran s'arrête là. Il ne nomme même pas le roi — il le laisse dans l'anonymat des hommes vaincus. L'identification à Nimrod, et la fin par la mouche, viennent des Israeliyyât (récits juifs anciens) repris par Tabarî et Ibn Kathîr — qui eux-mêmes les rapportaient sans les confirmer ('wa-Allâhu a'lam'). On les raconte ici comme image, pas comme révélation. Ni d'un poison. Ni d'une révolte.</w:t>
       </w:r>
     </w:p>
     <w:p>
@@ -1283,7 +1299,7 @@
           <w:sz w:val="22"/>
           <w:szCs w:val="22"/>
         </w:rPr>
-        <w:t xml:space="preserve">Ils rebroussèrent chemin, et trouvèrent un homme assis sur un rocher. Il portait un manteau vert. Son visage était calme — d'un calme qui dérangeait.</w:t>
+        <w:t xml:space="preserve">Ils rebroussèrent chemin, et trouvèrent un homme assis sur un rocher. Il portait — selon la tradition qui l’imagine en manteau vert, son nom signifiant ‘le vert’ — un visage calme. Son visage était calme — d'un calme qui dérangeait.</w:t>
       </w:r>
     </w:p>
     <w:p>
@@ -1620,7 +1636,7 @@
           <w:sz w:val="18"/>
           <w:szCs w:val="18"/>
         </w:rPr>
-        <w:t xml:space="preserve">Source : Sourate Al-Kahf (18:60-82) — identification d'Al-Khidr par les hadiths (Bukhari, Muslim) · Note : statut prophétique débattu — position majoritaire chez les sunnites : prophète</w:t>
+        <w:t xml:space="preserve">Source : Sourate Al-Kahf (18:60-82) — identification d'Al-Khidr par les hadiths (Bukhari, Muslim) · Note : son statut est débattu — prophète selon plusieurs avis (Ibn Kathîr, Ibn Taymiyya), serviteur particulier ('abd) d'Allâh selon d'autres (Ibn Hazm). Allâh sait mieux.</w:t>
       </w:r>
     </w:p>
     <w:p>
@@ -2708,12 +2724,28 @@
       <w:r>
         <w:rPr>
           <w:rFonts w:ascii="Cormorant Garamond" w:cs="Cormorant Garamond" w:eastAsia="Cormorant Garamond" w:hAnsi="Cormorant Garamond"/>
-          <w:i w:val="false"/>
-          <w:iCs w:val="false"/>
-          <w:sz w:val="22"/>
-          <w:szCs w:val="22"/>
-        </w:rPr>
-        <w:t xml:space="preserve">Un jour, ils présentèrent chacun une offrande. Habil donna sa meilleure bête. Qabil donna ce qu'il avait sous la main.</w:t>
+          <w:i/>
+          <w:iCs/>
+          <w:color w:val="888888"/>
+          <w:sz w:val="22"/>
+          <w:szCs w:val="22"/>
+        </w:rPr>
+        <w:t xml:space="preserve">Le Coran ne les nomme pas — il dit simplement ‘les deux fils d’Adam’ (5:27). La tradition antérieure (juive et chrétienne) leur donne les noms de Habil et Qabil.</w:t>
+      </w:r>
+    </w:p>
+    <w:p>
+      <w:pPr>
+        <w:spacing w:after="60"/>
+      </w:pPr>
+      <w:r>
+        <w:rPr>
+          <w:rFonts w:ascii="Cormorant Garamond" w:cs="Cormorant Garamond" w:eastAsia="Cormorant Garamond" w:hAnsi="Cormorant Garamond"/>
+          <w:i w:val="false"/>
+          <w:iCs w:val="false"/>
+          <w:sz w:val="22"/>
+          <w:szCs w:val="22"/>
+        </w:rPr>
+        <w:t xml:space="preserve">Un jour, ils présentèrent chacun une offrande. Chacun fit une offrande. La tradition exégétique précise que Habil donna le meilleur de son troupeau, et Qabil ce qu'il avait sous la main — le Coran lui-même dit seulement qu'une offrande fut acceptée, l'autre non.</w:t>
       </w:r>
     </w:p>
     <w:p>
@@ -3466,7 +3498,7 @@
           <w:sz w:val="22"/>
           <w:szCs w:val="22"/>
         </w:rPr>
-        <w:t xml:space="preserve">De la roche elle-même — devant leurs yeux — sortit une chamelle. Une chamelle énorme, splendide, qui n'avait pas d'ombre et pas de blessure, qui n'avait pas été engendrée, qui n'avait jamais bu une goutte d'eau qu'Allah ne lui avait promise.</w:t>
+        <w:t xml:space="preserve">Allâh leur donna une chamelle — un signe. Le Coran l'appelle nâqat Allâh, 'la chamelle d'Allâh' (7:73). Il ne décrit pas comment elle vint. La tradition exégétique (Tabarî, Ibn Kathîr) raconte qu'elle sortit de la roche, sous leurs yeux — mais ce détail vient des Israeliyyât, pas du Coran lui-même. Ce qui est sûr, c'est qu'elle était un signe immense, qu'elle buvait à la source un jour, et que le peuple buvait l'autre.</w:t>
       </w:r>
     </w:p>
     <w:p>
@@ -3588,37 +3620,7 @@
           <w:sz w:val="22"/>
           <w:szCs w:val="22"/>
         </w:rPr>
-        <w:t xml:space="preserve">Le premier jour, leur visage devint jaune.</w:t>
-      </w:r>
-    </w:p>
-    <w:p>
-      <w:pPr>
-        <w:spacing w:after="60"/>
-      </w:pPr>
-      <w:r>
-        <w:rPr>
-          <w:rFonts w:ascii="Cormorant Garamond" w:cs="Cormorant Garamond" w:eastAsia="Cormorant Garamond" w:hAnsi="Cormorant Garamond"/>
-          <w:i w:val="false"/>
-          <w:iCs w:val="false"/>
-          <w:sz w:val="22"/>
-          <w:szCs w:val="22"/>
-        </w:rPr>
-        <w:t xml:space="preserve">Le deuxième jour, leur visage devint rouge.</w:t>
-      </w:r>
-    </w:p>
-    <w:p>
-      <w:pPr>
-        <w:spacing w:after="60"/>
-      </w:pPr>
-      <w:r>
-        <w:rPr>
-          <w:rFonts w:ascii="Cormorant Garamond" w:cs="Cormorant Garamond" w:eastAsia="Cormorant Garamond" w:hAnsi="Cormorant Garamond"/>
-          <w:i w:val="false"/>
-          <w:iCs w:val="false"/>
-          <w:sz w:val="22"/>
-          <w:szCs w:val="22"/>
-        </w:rPr>
-        <w:t xml:space="preserve">Le troisième jour, leur visage devint noir.</w:t>
+        <w:t xml:space="preserve">Le Coran (11:65) dit : ‘Profitez de votre demeure pendant trois jours.’ Trois jours pour comprendre. Trois jours pour revenir. La tradition exégétique précise que leur visage devint jaune le premier jour, rouge le deuxième, noir le troisième — détails non coraniques, transmis par les anciens.</w:t>
       </w:r>
     </w:p>
     <w:p>
@@ -3751,7 +3753,7 @@
           <w:sz w:val="22"/>
           <w:szCs w:val="22"/>
         </w:rPr>
-        <w:t xml:space="preserve">Les Ad étaient des géants. Allah leur avait donné une taille au-delà des hommes, une force sans pareille, des bras qui pouvaient déplacer des pierres comme on déplace des grains de sable.</w:t>
+        <w:t xml:space="preserve">Les Ad étaient un peuple immense en force. Le Coran (7:69) dit qu’Allâh les avait ‘comblés en stature’ (bastatan fî-l-khalq) — ce qui peut signifier puissance physique ou taille. La tradition exégétique les a souvent décrits comme des géants au sens propre, mais le Coran lui-même reste plus mesuré, des bras qui pouvaient déplacer des pierres comme on déplace des grains de sable.</w:t>
       </w:r>
     </w:p>
     <w:p>
@@ -3919,7 +3921,7 @@
           <w:sz w:val="22"/>
           <w:szCs w:val="22"/>
         </w:rPr>
-        <w:t xml:space="preserve">Trois ans sans pluie. Les sources s'asséchèrent. Le bétail mourut. La terre se fissura. Les Ad attendirent — comme tous les peuples attendent — un signe du ciel.</w:t>
+        <w:t xml:space="preserve">Une longue sécheresse vint. Les sources s’asséchèrent. Le bétail mourut. (La tradition parle de trois ans — le Coran n’en précise pas la durée.). Les sources s'asséchèrent. Le bétail mourut. La terre se fissura. Les Ad attendirent — comme tous les peuples attendent — un signe du ciel.</w:t>
       </w:r>
     </w:p>
     <w:p>
@@ -4279,7 +4281,7 @@
           <w:sz w:val="22"/>
           <w:szCs w:val="22"/>
         </w:rPr>
-        <w:t xml:space="preserve">Elle marcha pour lui. Elle mendia pour lui. Elle se vendit même ses cheveux — sa parure — pour pouvoir nourrir Ayoub un jour de plus.</w:t>
+        <w:t xml:space="preserve">Elle marcha pour lui. Elle mendia pour lui. Elle resta — quand tout le reste avait fui. La tradition exégétique (non coranique) raconte qu’elle vendit jusqu’à ses cheveux pour le nourrir. Le Coran retient surtout ceci : qu’Ayoub a tenu, et que sa femme aussi.</w:t>
       </w:r>
     </w:p>
     <w:p>
@@ -4325,7 +4327,7 @@
           <w:sz w:val="22"/>
           <w:szCs w:val="22"/>
         </w:rPr>
-        <w:t xml:space="preserve">Dix-huit ans passèrent ainsi.</w:t>
+        <w:t xml:space="preserve">Des années passèrent — la tradition parle de 18 ans, parfois de 13, parfois de 7. Le Coran ne précise pas la durée. Il dit seulement qu’Ayoub a été éprouvé longtemps, et qu’il a tenu.</w:t>
       </w:r>
     </w:p>
     <w:p>
@@ -4434,6 +4436,21 @@
           <w:szCs w:val="22"/>
         </w:rPr>
         <w:t xml:space="preserve">« Voilà une eau pour te laver, et une eau pour boire. »</w:t>
+      </w:r>
+    </w:p>
+    <w:p>
+      <w:pPr>
+        <w:spacing w:after="60"/>
+      </w:pPr>
+      <w:r>
+        <w:rPr>
+          <w:rFonts w:ascii="Cormorant Garamond" w:cs="Cormorant Garamond" w:eastAsia="Cormorant Garamond" w:hAnsi="Cormorant Garamond"/>
+          <w:i w:val="false"/>
+          <w:iCs w:val="false"/>
+          <w:sz w:val="22"/>
+          <w:szCs w:val="22"/>
+        </w:rPr>
+        <w:t xml:space="preserve">Il y avait eu, dans son épreuve, un moment où Ayoub s’était emporté contre sa femme — et avait juré, dans la fatigue de la souffrance, de la frapper. Allâh, qui aime la douceur, lui dit : ‘Prends en ta main un faisceau de brindilles. Frappe avec — et ne viole pas ton serment.’ (Sourate Sad 38:44.) Un faisceau de brindilles. Une caresse symbolique. Allâh enseigne, jusque dans la résolution des serments, qu’il existe toujours un chemin qui ne blesse personne.</w:t>
       </w:r>
     </w:p>
     <w:p>
@@ -5093,7 +5110,7 @@
           <w:sz w:val="22"/>
           <w:szCs w:val="22"/>
         </w:rPr>
-        <w:t xml:space="preserve">La huppe partit. Bilqis — la reine de Saba — trouva la lettre sur ses coussins, sans savoir comment elle y était arrivée.</w:t>
+        <w:t xml:space="preserve">La huppe partit. La reine de Saba — la tradition exégétique l’appelle Bilqis, nom non mentionné dans le Coran — trouva la lettre sur ses coussins, sans savoir comment elle y était arrivée.</w:t>
       </w:r>
     </w:p>
     <w:p>
@@ -6016,7 +6033,7 @@
           <w:sz w:val="22"/>
           <w:szCs w:val="22"/>
         </w:rPr>
-        <w:t xml:space="preserve">Sans armure. Sans épée. Avec une fronde et — selon la tradition antérieure à l'Islam — cinq pierres ramassées dans le lit du fleuve.</w:t>
+        <w:t xml:space="preserve">Sans armure. Sans épée. Le Coran dit simplement qu'il a tué Jalut (2:251). Les détails — fronde, pierres ramassées dans le fleuve, pierre dans le front du géant — viennent de la tradition biblique antérieure, reprise par certains exégètes. On les raconte ici par habitude littéraire.</w:t>
       </w:r>
     </w:p>
     <w:p>

</xml_diff>